<commit_message>
Update Week 3 Homework
</commit_message>
<xml_diff>
--- a/Week 3/Homework/Homework for week 3.docx
+++ b/Week 3/Homework/Homework for week 3.docx
@@ -94,6 +94,20 @@
         </w:rPr>
         <w:t xml:space="preserve">table below. </w:t>
       </w:r>
+      <w:r>
+        <w:rPr>
+          <w:rFonts w:ascii="Times New Roman" w:hAnsi="Times New Roman" w:cs="Times New Roman" w:hint="eastAsia"/>
+          <w:lang w:val="en-US"/>
+        </w:rPr>
+        <w:t>If</w:t>
+      </w:r>
+      <w:r>
+        <w:rPr>
+          <w:rFonts w:ascii="Times New Roman" w:hAnsi="Times New Roman" w:cs="Times New Roman"/>
+          <w:lang w:val="en-US"/>
+        </w:rPr>
+        <w:t xml:space="preserve"> you use AI-agent or R to facilitate this process, please paste code or script at the end.</w:t>
+      </w:r>
     </w:p>
     <w:tbl>
       <w:tblPr>
@@ -757,6 +771,27 @@
           <w:lang w:val="en-US"/>
         </w:rPr>
         <w:t>.</w:t>
+      </w:r>
+      <w:r>
+        <w:rPr>
+          <w:rFonts w:ascii="Times New Roman" w:hAnsi="Times New Roman" w:cs="Times New Roman"/>
+          <w:lang w:val="en-US"/>
+        </w:rPr>
+        <w:t xml:space="preserve"> </w:t>
+      </w:r>
+      <w:r>
+        <w:rPr>
+          <w:rFonts w:ascii="Times New Roman" w:hAnsi="Times New Roman" w:cs="Times New Roman" w:hint="eastAsia"/>
+          <w:lang w:val="en-US"/>
+        </w:rPr>
+        <w:t>If</w:t>
+      </w:r>
+      <w:r>
+        <w:rPr>
+          <w:rFonts w:ascii="Times New Roman" w:hAnsi="Times New Roman" w:cs="Times New Roman"/>
+          <w:lang w:val="en-US"/>
+        </w:rPr>
+        <w:t xml:space="preserve"> you use AI-agent or R to facilitate this process, please paste code or script at the end.</w:t>
       </w:r>
     </w:p>
     <w:tbl>

</xml_diff>